<commit_message>
Tony Tornado: revisão da Parte 5
Co-Authored-By: Claude Opus 5.5 <noreply@anthropic.com>
Claude-Session: https://claude.ai/code/session_01MJjUEEZrxQDEUifKK2vj9g
</commit_message>
<xml_diff>
--- a/roteiros/tony-tornado/Tony_Parte5.docx
+++ b/roteiros/tony-tornado/Tony_Parte5.docx
@@ -31,7 +31,7 @@
         <w:rPr>
           <w:color w:val="000000"/>
         </w:rPr>
-        <w:t>O homem que a ditadura vigiava como ameaça passou a entrar, todas as noites, na sala das famílias brasileiras.</w:t>
+        <w:t>O homem que a ditadura tratava como ameaça passou a entrar, todas as noites, na sala das famílias brasileiras.</w:t>
       </w:r>
     </w:p>
     <w:p>
@@ -119,7 +119,7 @@
         <w:rPr>
           <w:color w:val="000000"/>
         </w:rPr>
-        <w:t>O censurado de Deus Negro, numa novela que também tinha sido censurada. Os dois voltaram juntos para a casa dos brasileiros, quando a ditadura já tinha acabado.</w:t>
+        <w:t>O cantor que teve Deus Negro censurado estava agora numa novela que também tinha sido censurada. Os dois chegaram juntos à casa dos brasileiros, quando a ditadura já tinha acabado.</w:t>
       </w:r>
     </w:p>
     <w:p>
@@ -159,7 +159,7 @@
         <w:rPr>
           <w:color w:val="000000"/>
         </w:rPr>
-        <w:t>Recentemente, estava no elenco da novela Êta Mundo Melhor!, na Globo.</w:t>
+        <w:t>Em dois mil e quinze, aos oitenta e cinco anos, chegou a se apresentar no Rock in Rio. Recentemente, estava no elenco da novela Êta Mundo Melhor!, na Globo.</w:t>
       </w:r>
     </w:p>
     <w:p>
@@ -167,7 +167,7 @@
         <w:rPr>
           <w:color w:val="C00000"/>
         </w:rPr>
-        <w:t>Até que, em setembro de dois mil e vinte e seis, aos noventa e seis anos, Tony Tornado subiu num palco que nenhum artista daquela idade tinha pisado antes. E a música que ele escolheu cantar fecha, de um jeito quase impossível, uma história que tinha começado numa cadeia do Harlem, mais de sessenta anos antes.</w:t>
+        <w:t>Até que, em setembro de dois mil e vinte e seis, aos noventa e seis anos, Tony Tornado voltou ao Rock in Rio e virou o artista mais velho a pisar no palco do festival. E a música que ele cantou naquele dia fecha, de um jeito quase impossível, uma história que tinha começado numa cadeia do Harlem, mais de sessenta anos antes.</w:t>
       </w:r>
     </w:p>
     <w:p>
@@ -215,7 +215,7 @@
         <w:rPr>
           <w:color w:val="000000"/>
         </w:rPr>
-        <w:t>O rapaz da Tijuca. O brasileiro que um dia foi preso em Nova York, e que saiu da cadeia porque alguém gritou na rua "Ô, Comfort".</w:t>
+        <w:t>O rapaz da Tijuca. O mesmo que, nos anos sessenta, estava preso em Nova York quando alguém avisou na rua: "Ô, Comfort, tem um brasileiro pegado lá embaixo."</w:t>
       </w:r>
     </w:p>
     <w:p>
@@ -301,9 +301,17 @@
     <w:p>
       <w:r>
         <w:rPr>
+          <w:color w:val="C00000"/>
+        </w:rPr>
+        <w:t>Como se a história quisesse fechar mais um círculo, onze dias depois veio outra notícia. E ela vinha de um lugar que, décadas antes, tinha tratado Tony de um jeito muito diferente.</w:t>
+      </w:r>
+    </w:p>
+    <w:p>
+      <w:r>
+        <w:rPr>
           <w:color w:val="000000"/>
         </w:rPr>
-        <w:t>Onze dias depois, veio outra notícia. A Assembleia Legislativa do Rio de Janeiro aprovou a Medalha Tiradentes para Tony Tornado, a maior honraria concedida pelo parlamento do estado.</w:t>
+        <w:t>A Assembleia Legislativa do Rio de Janeiro aprovou a Medalha Tiradentes para Tony Tornado, a maior honraria concedida pelo parlamento do estado.</w:t>
       </w:r>
     </w:p>
     <w:p>
@@ -375,7 +383,7 @@
         <w:rPr>
           <w:color w:val="000000"/>
         </w:rPr>
-        <w:t>O Brasil passou décadas tentando dizer a ele quem ele podia ser. A polícia na infância. A imigração em Nova York. O colunista do jornal. Os militares da ditadura.</w:t>
+        <w:t>Durante décadas, muita gente tentou dizer a ele quem ele podia ser. A polícia na infância. A imigração em Nova York. O colunista do jornal. Os militares da ditadura.</w:t>
       </w:r>
     </w:p>
     <w:p>

</xml_diff>